<commit_message>
báo cáo: cập nhật bản chỉnh sửa chính thức báo cáo Word, bản PDF và slide thuyết trình
</commit_message>
<xml_diff>
--- a/Nhom12_BaoCao.docx
+++ b/Nhom12_BaoCao.docx
@@ -561,6 +561,7 @@
               <w:jc w:val="left"/>
               <w:rPr>
                 <w:bCs/>
+                <w:sz w:val="19"/>
               </w:rPr>
             </w:pPr>
             <w:r>
@@ -584,21 +585,88 @@
                 <w:bCs/>
                 <w:sz w:val="19"/>
               </w:rPr>
-              <w:t xml:space="preserve">Thuyết trình Phần 1 video báo cáo (Tổng quan </w:t>
-            </w:r>
+              <w:t>Xây dựng toàn diện ứng dụng tương tác Demo Streamlit 4 tab</w:t>
+            </w:r>
+          </w:p>
+          <w:p>
+            <w:pPr>
+              <w:spacing w:before="20" w:after="20" w:line="276" w:lineRule="auto"/>
+              <w:jc w:val="left"/>
+              <w:rPr>
+                <w:bCs/>
+              </w:rPr>
+            </w:pPr>
             <w:r>
               <w:rPr>
                 <w:bCs/>
                 <w:sz w:val="19"/>
               </w:rPr>
-              <w:t>và</w:t>
-            </w:r>
+              <w:t xml:space="preserve">Thuyết trình Phần 1 video báo cáo (Tổng </w:t>
+            </w:r>
+            <w:proofErr w:type="gramStart"/>
             <w:r>
               <w:rPr>
                 <w:bCs/>
                 <w:sz w:val="19"/>
               </w:rPr>
-              <w:t xml:space="preserve"> Tiền xử lý dữ liệu).</w:t>
+              <w:t xml:space="preserve">quan </w:t>
+            </w:r>
+            <w:r>
+              <w:rPr>
+                <w:bCs/>
+                <w:sz w:val="19"/>
+              </w:rPr>
+              <w:t>,</w:t>
+            </w:r>
+            <w:r>
+              <w:rPr>
+                <w:bCs/>
+                <w:sz w:val="19"/>
+              </w:rPr>
+              <w:t>Tiền</w:t>
+            </w:r>
+            <w:proofErr w:type="gramEnd"/>
+            <w:r>
+              <w:rPr>
+                <w:bCs/>
+                <w:sz w:val="19"/>
+              </w:rPr>
+              <w:t xml:space="preserve"> xử lý dữ liệu</w:t>
+            </w:r>
+            <w:r>
+              <w:rPr>
+                <w:bCs/>
+                <w:sz w:val="19"/>
+              </w:rPr>
+              <w:t xml:space="preserve"> </w:t>
+            </w:r>
+            <w:r>
+              <w:rPr>
+                <w:bCs/>
+                <w:sz w:val="19"/>
+              </w:rPr>
+              <w:t>và</w:t>
+            </w:r>
+            <w:r>
+              <w:rPr>
+                <w:bCs/>
+                <w:sz w:val="19"/>
+              </w:rPr>
+              <w:t xml:space="preserve"> </w:t>
+            </w:r>
+            <w:r>
+              <w:rPr>
+                <w:bCs/>
+                <w:sz w:val="19"/>
+              </w:rPr>
+              <w:t>Demo</w:t>
+            </w:r>
+            <w:r>
+              <w:rPr>
+                <w:bCs/>
+                <w:sz w:val="19"/>
+              </w:rPr>
+              <w:t>).</w:t>
             </w:r>
           </w:p>
         </w:tc>
@@ -976,7 +1044,21 @@
                 <w:bCs/>
                 <w:sz w:val="19"/>
               </w:rPr>
-              <w:t>Thực hiện hậu kiểm độc lập ANOVA điểm hạnh phúc; xây dựng thuật toán ghép cụm và lập bảng dịch chuyển cụm 156 quốc gia qua 5 năm.</w:t>
+              <w:t>Thực hiện hậu kiểm độc lập ANOVA điểm hạnh phúc</w:t>
+            </w:r>
+            <w:r>
+              <w:rPr>
+                <w:bCs/>
+                <w:sz w:val="19"/>
+              </w:rPr>
+              <w:t>,</w:t>
+            </w:r>
+            <w:r>
+              <w:rPr>
+                <w:bCs/>
+                <w:sz w:val="19"/>
+              </w:rPr>
+              <w:t xml:space="preserve"> xây dựng thuật toán ghép cụm và lập bảng dịch chuyển cụm 156 quốc gia qua 5 năm.</w:t>
             </w:r>
           </w:p>
           <w:p>
@@ -992,7 +1074,14 @@
                 <w:bCs/>
                 <w:sz w:val="19"/>
               </w:rPr>
-              <w:t>Xây dựng toàn diện ứng dụng tương tác Demo Streamlit 4 tab; biên soạn phần diễn giải Chương 4, Chương 5 và thiết kế slide thuyết trình.</w:t>
+              <w:t>B</w:t>
+            </w:r>
+            <w:r>
+              <w:rPr>
+                <w:bCs/>
+                <w:sz w:val="19"/>
+              </w:rPr>
+              <w:t>iên soạn phần diễn giải Chương 4, Chương 5 và thiết kế slide thuyết trình.</w:t>
             </w:r>
           </w:p>
           <w:p>
@@ -1008,7 +1097,21 @@
                 <w:bCs/>
                 <w:sz w:val="19"/>
               </w:rPr>
-              <w:t>Thuyết trình Phần 3 video báo cáo (Diễn giải tri thức, Dịch chuyển cụm, Demo &amp; Kết luận).</w:t>
+              <w:t xml:space="preserve">Thuyết trình Phần 3 video báo cáo (Diễn giải tri thức, Dịch chuyển cụm, </w:t>
+            </w:r>
+            <w:r>
+              <w:rPr>
+                <w:bCs/>
+                <w:sz w:val="19"/>
+              </w:rPr>
+              <w:t>và</w:t>
+            </w:r>
+            <w:r>
+              <w:rPr>
+                <w:bCs/>
+                <w:sz w:val="19"/>
+              </w:rPr>
+              <w:t xml:space="preserve"> Kết luận).</w:t>
             </w:r>
           </w:p>
         </w:tc>
@@ -5705,7 +5808,7 @@
     </w:p>
     <w:p>
       <w:pPr>
-        <w:ind w:firstLine="425"/>
+        <w:ind w:firstLine="720"/>
       </w:pPr>
       <w:r>
         <w:t>Bốn câu hỏi nghiên cứu:</w:t>
@@ -5713,61 +5816,53 @@
     </w:p>
     <w:p>
       <w:pPr>
+        <w:pStyle w:val="ListParagraph"/>
+        <w:numPr>
+          <w:ilvl w:val="0"/>
+          <w:numId w:val="24"/>
+        </w:numPr>
         <w:spacing w:before="40" w:line="312" w:lineRule="auto"/>
-        <w:ind w:left="425"/>
-      </w:pPr>
-      <w:r>
-        <w:rPr>
-          <w:b/>
-        </w:rPr>
-        <w:t xml:space="preserve">1. </w:t>
-      </w:r>
+      </w:pPr>
       <w:r>
         <w:t>Có thể chia các quốc gia thành bao nhiêu nhóm dựa trên sáu yếu tố cơ sở, và số cụm tối ưu có ổn định qua các năm không?</w:t>
       </w:r>
     </w:p>
     <w:p>
       <w:pPr>
+        <w:pStyle w:val="ListParagraph"/>
+        <w:numPr>
+          <w:ilvl w:val="0"/>
+          <w:numId w:val="24"/>
+        </w:numPr>
         <w:spacing w:before="40" w:line="312" w:lineRule="auto"/>
-        <w:ind w:left="425"/>
-      </w:pPr>
-      <w:r>
-        <w:rPr>
-          <w:b/>
-        </w:rPr>
-        <w:t xml:space="preserve">2. </w:t>
-      </w:r>
+      </w:pPr>
       <w:r>
         <w:t>Cách chuẩn hóa dữ liệu (Raw, Min-Max, Z-score) ảnh hưởng thế nào đến kết quả K-Means?</w:t>
       </w:r>
     </w:p>
     <w:p>
       <w:pPr>
+        <w:pStyle w:val="ListParagraph"/>
+        <w:numPr>
+          <w:ilvl w:val="0"/>
+          <w:numId w:val="24"/>
+        </w:numPr>
         <w:spacing w:before="40" w:line="312" w:lineRule="auto"/>
-        <w:ind w:left="425"/>
-      </w:pPr>
-      <w:r>
-        <w:rPr>
-          <w:b/>
-        </w:rPr>
+      </w:pPr>
+      <w:r>
         <w:lastRenderedPageBreak/>
-        <w:t xml:space="preserve">3. </w:t>
-      </w:r>
-      <w:r>
         <w:t>Phân cấp Ward và DBSCAN cho kết quả thế nào khi so sánh với K-Means trên cùng dữ liệu?</w:t>
       </w:r>
     </w:p>
     <w:p>
       <w:pPr>
+        <w:pStyle w:val="ListParagraph"/>
+        <w:numPr>
+          <w:ilvl w:val="0"/>
+          <w:numId w:val="24"/>
+        </w:numPr>
         <w:spacing w:before="40" w:line="312" w:lineRule="auto"/>
-        <w:ind w:left="425"/>
-      </w:pPr>
-      <w:r>
-        <w:rPr>
-          <w:b/>
-        </w:rPr>
-        <w:t xml:space="preserve">4. </w:t>
-      </w:r>
+      </w:pPr>
       <w:r>
         <w:t>Nhãn cụm có ổn định khi đổi seed khởi tạo, và các cụm hình thành từ sáu yếu tố có phân hóa theo điểm hạnh phúc thực tế hay không?</w:t>
       </w:r>
@@ -11593,12 +11688,6 @@
                           </m:r>
                         </m:e>
                       </m:d>
-                      <m:r>
-                        <w:rPr>
-                          <w:rFonts w:ascii="Cambria Math" w:hAnsi="Cambria Math"/>
-                        </w:rPr>
-                        <m:t>)</m:t>
-                      </m:r>
                     </m:e>
                   </m:d>
                 </m:e>
@@ -21567,8 +21656,8 @@
           <w:noProof/>
         </w:rPr>
         <w:drawing>
-          <wp:inline distT="0" distB="0" distL="0" distR="0" wp14:anchorId="344C16DF" wp14:editId="661642A0">
-            <wp:extent cx="4389120" cy="1094433"/>
+          <wp:inline distT="0" distB="0" distL="0" distR="0" wp14:anchorId="344C16DF" wp14:editId="3B919EFB">
+            <wp:extent cx="5452288" cy="2576946"/>
             <wp:effectExtent l="0" t="0" r="0" b="0"/>
             <wp:docPr id="9" name="Picture 9"/>
             <wp:cNvGraphicFramePr>
@@ -21590,7 +21679,7 @@
                   <pic:spPr>
                     <a:xfrm>
                       <a:off x="0" y="0"/>
-                      <a:ext cx="4389120" cy="1094433"/>
+                      <a:ext cx="5522715" cy="2610232"/>
                     </a:xfrm>
                     <a:prstGeom prst="rect">
                       <a:avLst/>
@@ -21642,8 +21731,8 @@
         </w:rPr>
         <w:lastRenderedPageBreak/>
         <w:drawing>
-          <wp:inline distT="0" distB="0" distL="0" distR="0" wp14:anchorId="7F06D740" wp14:editId="447CBE5E">
-            <wp:extent cx="3840480" cy="2199548"/>
+          <wp:inline distT="0" distB="0" distL="0" distR="0" wp14:anchorId="7F06D740" wp14:editId="783D639C">
+            <wp:extent cx="5432489" cy="3111335"/>
             <wp:effectExtent l="0" t="0" r="0" b="0"/>
             <wp:docPr id="10" name="Picture 10"/>
             <wp:cNvGraphicFramePr>
@@ -21665,7 +21754,7 @@
                   <pic:spPr>
                     <a:xfrm>
                       <a:off x="0" y="0"/>
-                      <a:ext cx="3840480" cy="2199548"/>
+                      <a:ext cx="5490826" cy="3144746"/>
                     </a:xfrm>
                     <a:prstGeom prst="rect">
                       <a:avLst/>
@@ -25746,6 +25835,96 @@
     </w:lvl>
   </w:abstractNum>
   <w:abstractNum w:abstractNumId="13" w15:restartNumberingAfterBreak="0">
+    <w:nsid w:val="289A46B1"/>
+    <w:multiLevelType w:val="hybridMultilevel"/>
+    <w:tmpl w:val="BC44126E"/>
+    <w:lvl w:ilvl="0" w:tplc="79F4E83A">
+      <w:start w:val="1"/>
+      <w:numFmt w:val="decimal"/>
+      <w:lvlText w:val="%1."/>
+      <w:lvlJc w:val="left"/>
+      <w:pPr>
+        <w:ind w:left="785" w:hanging="360"/>
+      </w:pPr>
+      <w:rPr>
+        <w:rFonts w:hint="default"/>
+        <w:b/>
+      </w:rPr>
+    </w:lvl>
+    <w:lvl w:ilvl="1" w:tplc="04090019" w:tentative="1">
+      <w:start w:val="1"/>
+      <w:numFmt w:val="lowerLetter"/>
+      <w:lvlText w:val="%2."/>
+      <w:lvlJc w:val="left"/>
+      <w:pPr>
+        <w:ind w:left="1505" w:hanging="360"/>
+      </w:pPr>
+    </w:lvl>
+    <w:lvl w:ilvl="2" w:tplc="0409001B" w:tentative="1">
+      <w:start w:val="1"/>
+      <w:numFmt w:val="lowerRoman"/>
+      <w:lvlText w:val="%3."/>
+      <w:lvlJc w:val="right"/>
+      <w:pPr>
+        <w:ind w:left="2225" w:hanging="180"/>
+      </w:pPr>
+    </w:lvl>
+    <w:lvl w:ilvl="3" w:tplc="0409000F" w:tentative="1">
+      <w:start w:val="1"/>
+      <w:numFmt w:val="decimal"/>
+      <w:lvlText w:val="%4."/>
+      <w:lvlJc w:val="left"/>
+      <w:pPr>
+        <w:ind w:left="2945" w:hanging="360"/>
+      </w:pPr>
+    </w:lvl>
+    <w:lvl w:ilvl="4" w:tplc="04090019" w:tentative="1">
+      <w:start w:val="1"/>
+      <w:numFmt w:val="lowerLetter"/>
+      <w:lvlText w:val="%5."/>
+      <w:lvlJc w:val="left"/>
+      <w:pPr>
+        <w:ind w:left="3665" w:hanging="360"/>
+      </w:pPr>
+    </w:lvl>
+    <w:lvl w:ilvl="5" w:tplc="0409001B" w:tentative="1">
+      <w:start w:val="1"/>
+      <w:numFmt w:val="lowerRoman"/>
+      <w:lvlText w:val="%6."/>
+      <w:lvlJc w:val="right"/>
+      <w:pPr>
+        <w:ind w:left="4385" w:hanging="180"/>
+      </w:pPr>
+    </w:lvl>
+    <w:lvl w:ilvl="6" w:tplc="0409000F" w:tentative="1">
+      <w:start w:val="1"/>
+      <w:numFmt w:val="decimal"/>
+      <w:lvlText w:val="%7."/>
+      <w:lvlJc w:val="left"/>
+      <w:pPr>
+        <w:ind w:left="5105" w:hanging="360"/>
+      </w:pPr>
+    </w:lvl>
+    <w:lvl w:ilvl="7" w:tplc="04090019" w:tentative="1">
+      <w:start w:val="1"/>
+      <w:numFmt w:val="lowerLetter"/>
+      <w:lvlText w:val="%8."/>
+      <w:lvlJc w:val="left"/>
+      <w:pPr>
+        <w:ind w:left="5825" w:hanging="360"/>
+      </w:pPr>
+    </w:lvl>
+    <w:lvl w:ilvl="8" w:tplc="0409001B" w:tentative="1">
+      <w:start w:val="1"/>
+      <w:numFmt w:val="lowerRoman"/>
+      <w:lvlText w:val="%9."/>
+      <w:lvlJc w:val="right"/>
+      <w:pPr>
+        <w:ind w:left="6545" w:hanging="180"/>
+      </w:pPr>
+    </w:lvl>
+  </w:abstractNum>
+  <w:abstractNum w:abstractNumId="14" w15:restartNumberingAfterBreak="0">
     <w:nsid w:val="2DA5497C"/>
     <w:multiLevelType w:val="hybridMultilevel"/>
     <w:tmpl w:val="16A4E22C"/>
@@ -25835,7 +26014,7 @@
       </w:pPr>
     </w:lvl>
   </w:abstractNum>
-  <w:abstractNum w:abstractNumId="14" w15:restartNumberingAfterBreak="0">
+  <w:abstractNum w:abstractNumId="15" w15:restartNumberingAfterBreak="0">
     <w:nsid w:val="33395DCE"/>
     <w:multiLevelType w:val="hybridMultilevel"/>
     <w:tmpl w:val="C6AEBD48"/>
@@ -25925,7 +26104,7 @@
       </w:pPr>
     </w:lvl>
   </w:abstractNum>
-  <w:abstractNum w:abstractNumId="15" w15:restartNumberingAfterBreak="0">
+  <w:abstractNum w:abstractNumId="16" w15:restartNumberingAfterBreak="0">
     <w:nsid w:val="371F55BF"/>
     <w:multiLevelType w:val="hybridMultilevel"/>
     <w:tmpl w:val="211EE4A2"/>
@@ -26015,7 +26194,98 @@
       </w:pPr>
     </w:lvl>
   </w:abstractNum>
-  <w:abstractNum w:abstractNumId="16" w15:restartNumberingAfterBreak="0">
+  <w:abstractNum w:abstractNumId="17" w15:restartNumberingAfterBreak="0">
+    <w:nsid w:val="38C46DEB"/>
+    <w:multiLevelType w:val="hybridMultilevel"/>
+    <w:tmpl w:val="3746D3C4"/>
+    <w:lvl w:ilvl="0" w:tplc="A8EE3B12">
+      <w:start w:val="1"/>
+      <w:numFmt w:val="decimal"/>
+      <w:lvlText w:val="%1."/>
+      <w:lvlJc w:val="left"/>
+      <w:pPr>
+        <w:ind w:left="785" w:hanging="360"/>
+      </w:pPr>
+      <w:rPr>
+        <w:rFonts w:hint="default"/>
+        <w:b w:val="0"/>
+        <w:bCs/>
+      </w:rPr>
+    </w:lvl>
+    <w:lvl w:ilvl="1" w:tplc="FFFFFFFF" w:tentative="1">
+      <w:start w:val="1"/>
+      <w:numFmt w:val="lowerLetter"/>
+      <w:lvlText w:val="%2."/>
+      <w:lvlJc w:val="left"/>
+      <w:pPr>
+        <w:ind w:left="1505" w:hanging="360"/>
+      </w:pPr>
+    </w:lvl>
+    <w:lvl w:ilvl="2" w:tplc="FFFFFFFF" w:tentative="1">
+      <w:start w:val="1"/>
+      <w:numFmt w:val="lowerRoman"/>
+      <w:lvlText w:val="%3."/>
+      <w:lvlJc w:val="right"/>
+      <w:pPr>
+        <w:ind w:left="2225" w:hanging="180"/>
+      </w:pPr>
+    </w:lvl>
+    <w:lvl w:ilvl="3" w:tplc="FFFFFFFF" w:tentative="1">
+      <w:start w:val="1"/>
+      <w:numFmt w:val="decimal"/>
+      <w:lvlText w:val="%4."/>
+      <w:lvlJc w:val="left"/>
+      <w:pPr>
+        <w:ind w:left="2945" w:hanging="360"/>
+      </w:pPr>
+    </w:lvl>
+    <w:lvl w:ilvl="4" w:tplc="FFFFFFFF" w:tentative="1">
+      <w:start w:val="1"/>
+      <w:numFmt w:val="lowerLetter"/>
+      <w:lvlText w:val="%5."/>
+      <w:lvlJc w:val="left"/>
+      <w:pPr>
+        <w:ind w:left="3665" w:hanging="360"/>
+      </w:pPr>
+    </w:lvl>
+    <w:lvl w:ilvl="5" w:tplc="FFFFFFFF" w:tentative="1">
+      <w:start w:val="1"/>
+      <w:numFmt w:val="lowerRoman"/>
+      <w:lvlText w:val="%6."/>
+      <w:lvlJc w:val="right"/>
+      <w:pPr>
+        <w:ind w:left="4385" w:hanging="180"/>
+      </w:pPr>
+    </w:lvl>
+    <w:lvl w:ilvl="6" w:tplc="FFFFFFFF" w:tentative="1">
+      <w:start w:val="1"/>
+      <w:numFmt w:val="decimal"/>
+      <w:lvlText w:val="%7."/>
+      <w:lvlJc w:val="left"/>
+      <w:pPr>
+        <w:ind w:left="5105" w:hanging="360"/>
+      </w:pPr>
+    </w:lvl>
+    <w:lvl w:ilvl="7" w:tplc="FFFFFFFF" w:tentative="1">
+      <w:start w:val="1"/>
+      <w:numFmt w:val="lowerLetter"/>
+      <w:lvlText w:val="%8."/>
+      <w:lvlJc w:val="left"/>
+      <w:pPr>
+        <w:ind w:left="5825" w:hanging="360"/>
+      </w:pPr>
+    </w:lvl>
+    <w:lvl w:ilvl="8" w:tplc="FFFFFFFF" w:tentative="1">
+      <w:start w:val="1"/>
+      <w:numFmt w:val="lowerRoman"/>
+      <w:lvlText w:val="%9."/>
+      <w:lvlJc w:val="right"/>
+      <w:pPr>
+        <w:ind w:left="6545" w:hanging="180"/>
+      </w:pPr>
+    </w:lvl>
+  </w:abstractNum>
+  <w:abstractNum w:abstractNumId="18" w15:restartNumberingAfterBreak="0">
     <w:nsid w:val="3F71126A"/>
     <w:multiLevelType w:val="hybridMultilevel"/>
     <w:tmpl w:val="49A48AF6"/>
@@ -26105,7 +26375,7 @@
       </w:pPr>
     </w:lvl>
   </w:abstractNum>
-  <w:abstractNum w:abstractNumId="17" w15:restartNumberingAfterBreak="0">
+  <w:abstractNum w:abstractNumId="19" w15:restartNumberingAfterBreak="0">
     <w:nsid w:val="42D22E65"/>
     <w:multiLevelType w:val="hybridMultilevel"/>
     <w:tmpl w:val="752C9F70"/>
@@ -26191,7 +26461,7 @@
       </w:pPr>
     </w:lvl>
   </w:abstractNum>
-  <w:abstractNum w:abstractNumId="18" w15:restartNumberingAfterBreak="0">
+  <w:abstractNum w:abstractNumId="20" w15:restartNumberingAfterBreak="0">
     <w:nsid w:val="49C31151"/>
     <w:multiLevelType w:val="hybridMultilevel"/>
     <w:tmpl w:val="1D581780"/>
@@ -26304,7 +26574,7 @@
       </w:rPr>
     </w:lvl>
   </w:abstractNum>
-  <w:abstractNum w:abstractNumId="19" w15:restartNumberingAfterBreak="0">
+  <w:abstractNum w:abstractNumId="21" w15:restartNumberingAfterBreak="0">
     <w:nsid w:val="5225266E"/>
     <w:multiLevelType w:val="hybridMultilevel"/>
     <w:tmpl w:val="FB94EF48"/>
@@ -26393,10 +26663,96 @@
       </w:pPr>
     </w:lvl>
   </w:abstractNum>
-  <w:abstractNum w:abstractNumId="20" w15:restartNumberingAfterBreak="0">
+  <w:abstractNum w:abstractNumId="22" w15:restartNumberingAfterBreak="0">
     <w:nsid w:val="5B3011CC"/>
     <w:multiLevelType w:val="hybridMultilevel"/>
     <w:tmpl w:val="C5D4EF88"/>
+    <w:lvl w:ilvl="0" w:tplc="0409000F">
+      <w:start w:val="1"/>
+      <w:numFmt w:val="decimal"/>
+      <w:lvlText w:val="%1."/>
+      <w:lvlJc w:val="left"/>
+      <w:pPr>
+        <w:ind w:left="1145" w:hanging="360"/>
+      </w:pPr>
+    </w:lvl>
+    <w:lvl w:ilvl="1" w:tplc="04090019" w:tentative="1">
+      <w:start w:val="1"/>
+      <w:numFmt w:val="lowerLetter"/>
+      <w:lvlText w:val="%2."/>
+      <w:lvlJc w:val="left"/>
+      <w:pPr>
+        <w:ind w:left="1865" w:hanging="360"/>
+      </w:pPr>
+    </w:lvl>
+    <w:lvl w:ilvl="2" w:tplc="0409001B" w:tentative="1">
+      <w:start w:val="1"/>
+      <w:numFmt w:val="lowerRoman"/>
+      <w:lvlText w:val="%3."/>
+      <w:lvlJc w:val="right"/>
+      <w:pPr>
+        <w:ind w:left="2585" w:hanging="180"/>
+      </w:pPr>
+    </w:lvl>
+    <w:lvl w:ilvl="3" w:tplc="0409000F" w:tentative="1">
+      <w:start w:val="1"/>
+      <w:numFmt w:val="decimal"/>
+      <w:lvlText w:val="%4."/>
+      <w:lvlJc w:val="left"/>
+      <w:pPr>
+        <w:ind w:left="3305" w:hanging="360"/>
+      </w:pPr>
+    </w:lvl>
+    <w:lvl w:ilvl="4" w:tplc="04090019" w:tentative="1">
+      <w:start w:val="1"/>
+      <w:numFmt w:val="lowerLetter"/>
+      <w:lvlText w:val="%5."/>
+      <w:lvlJc w:val="left"/>
+      <w:pPr>
+        <w:ind w:left="4025" w:hanging="360"/>
+      </w:pPr>
+    </w:lvl>
+    <w:lvl w:ilvl="5" w:tplc="0409001B" w:tentative="1">
+      <w:start w:val="1"/>
+      <w:numFmt w:val="lowerRoman"/>
+      <w:lvlText w:val="%6."/>
+      <w:lvlJc w:val="right"/>
+      <w:pPr>
+        <w:ind w:left="4745" w:hanging="180"/>
+      </w:pPr>
+    </w:lvl>
+    <w:lvl w:ilvl="6" w:tplc="0409000F" w:tentative="1">
+      <w:start w:val="1"/>
+      <w:numFmt w:val="decimal"/>
+      <w:lvlText w:val="%7."/>
+      <w:lvlJc w:val="left"/>
+      <w:pPr>
+        <w:ind w:left="5465" w:hanging="360"/>
+      </w:pPr>
+    </w:lvl>
+    <w:lvl w:ilvl="7" w:tplc="04090019" w:tentative="1">
+      <w:start w:val="1"/>
+      <w:numFmt w:val="lowerLetter"/>
+      <w:lvlText w:val="%8."/>
+      <w:lvlJc w:val="left"/>
+      <w:pPr>
+        <w:ind w:left="6185" w:hanging="360"/>
+      </w:pPr>
+    </w:lvl>
+    <w:lvl w:ilvl="8" w:tplc="0409001B" w:tentative="1">
+      <w:start w:val="1"/>
+      <w:numFmt w:val="lowerRoman"/>
+      <w:lvlText w:val="%9."/>
+      <w:lvlJc w:val="right"/>
+      <w:pPr>
+        <w:ind w:left="6905" w:hanging="180"/>
+      </w:pPr>
+    </w:lvl>
+  </w:abstractNum>
+  <w:abstractNum w:abstractNumId="23" w15:restartNumberingAfterBreak="0">
+    <w:nsid w:val="7446619F"/>
+    <w:multiLevelType w:val="hybridMultilevel"/>
+    <w:tmpl w:val="BA6A1DD6"/>
     <w:lvl w:ilvl="0" w:tplc="0409000F">
       <w:start w:val="1"/>
       <w:numFmt w:val="decimal"/>
@@ -26507,31 +26863,31 @@
     <w:abstractNumId w:val="0"/>
   </w:num>
   <w:num w:numId="10" w16cid:durableId="1346711186">
-    <w:abstractNumId w:val="18"/>
+    <w:abstractNumId w:val="20"/>
   </w:num>
   <w:num w:numId="11" w16cid:durableId="481392401">
     <w:abstractNumId w:val="12"/>
   </w:num>
   <w:num w:numId="12" w16cid:durableId="221596583">
-    <w:abstractNumId w:val="13"/>
+    <w:abstractNumId w:val="14"/>
   </w:num>
   <w:num w:numId="13" w16cid:durableId="234127028">
     <w:abstractNumId w:val="11"/>
   </w:num>
   <w:num w:numId="14" w16cid:durableId="1533885141">
+    <w:abstractNumId w:val="16"/>
+  </w:num>
+  <w:num w:numId="15" w16cid:durableId="993067606">
+    <w:abstractNumId w:val="22"/>
+  </w:num>
+  <w:num w:numId="16" w16cid:durableId="1138844222">
     <w:abstractNumId w:val="15"/>
   </w:num>
-  <w:num w:numId="15" w16cid:durableId="993067606">
-    <w:abstractNumId w:val="20"/>
-  </w:num>
-  <w:num w:numId="16" w16cid:durableId="1138844222">
-    <w:abstractNumId w:val="14"/>
-  </w:num>
   <w:num w:numId="17" w16cid:durableId="1065956820">
-    <w:abstractNumId w:val="17"/>
+    <w:abstractNumId w:val="19"/>
   </w:num>
   <w:num w:numId="18" w16cid:durableId="1837569404">
-    <w:abstractNumId w:val="16"/>
+    <w:abstractNumId w:val="18"/>
   </w:num>
   <w:num w:numId="19" w16cid:durableId="103615725">
     <w:abstractNumId w:val="10"/>
@@ -26540,7 +26896,16 @@
     <w:abstractNumId w:val="9"/>
   </w:num>
   <w:num w:numId="21" w16cid:durableId="525099853">
-    <w:abstractNumId w:val="19"/>
+    <w:abstractNumId w:val="21"/>
+  </w:num>
+  <w:num w:numId="22" w16cid:durableId="1841582798">
+    <w:abstractNumId w:val="23"/>
+  </w:num>
+  <w:num w:numId="23" w16cid:durableId="137192746">
+    <w:abstractNumId w:val="13"/>
+  </w:num>
+  <w:num w:numId="24" w16cid:durableId="779884994">
+    <w:abstractNumId w:val="17"/>
   </w:num>
 </w:numbering>
 </file>

</xml_diff>

<commit_message>
bao cao: bo sung phu luc huong dan chay, cau truc ma nguon va link video thuyet trinh
</commit_message>
<xml_diff>
--- a/Nhom12_BaoCao.docx
+++ b/Nhom12_BaoCao.docx
@@ -25136,14 +25136,1217 @@
     </w:tbl>
     <w:p>
       <w:pPr>
-        <w:spacing w:after="40"/>
-      </w:pPr>
+        <w:spacing w:before="0" w:after="0"/>
+      </w:pPr>
+      <w:r>
+        <w:br w:type="page"/>
+      </w:r>
     </w:p>
     <w:p>
       <w:pPr>
-        <w:spacing w:after="40"/>
-      </w:pPr>
+        <w:pStyle w:val="Heading1"/>
+        <w:spacing w:line="360" w:lineRule="auto" w:before="240" w:after="120"/>
+        <w:jc w:val="left"/>
+      </w:pPr>
+      <w:r/>
+      <w:r>
+        <w:rPr>
+          <w:rFonts w:ascii="Times New Roman" w:hAnsi="Times New Roman"/>
+          <w:b/>
+          <w:i w:val="0"/>
+          <w:sz w:val="30"/>
+        </w:rPr>
+        <w:t>PHỤ LỤC C: CẤU TRÚC THƯ MỤC MÃ NGUỒN VÀ HƯỚNG DẪN THỰC THI</w:t>
+      </w:r>
     </w:p>
+    <w:p>
+      <w:pPr>
+        <w:pStyle w:val="Heading2"/>
+        <w:spacing w:line="360" w:lineRule="auto" w:before="120" w:after="80"/>
+        <w:jc w:val="left"/>
+      </w:pPr>
+      <w:r/>
+      <w:r>
+        <w:rPr>
+          <w:rFonts w:ascii="Times New Roman" w:hAnsi="Times New Roman"/>
+          <w:b/>
+          <w:i w:val="0"/>
+          <w:sz w:val="26"/>
+        </w:rPr>
+        <w:t>C.1. Cấu trúc thư mục mã nguồn đồ án</w:t>
+      </w:r>
+    </w:p>
+    <w:p>
+      <w:pPr>
+        <w:spacing w:line="360" w:lineRule="auto" w:before="0" w:after="80"/>
+        <w:jc w:val="both"/>
+      </w:pPr>
+      <w:r/>
+      <w:r>
+        <w:rPr>
+          <w:rFonts w:ascii="Times New Roman" w:hAnsi="Times New Roman"/>
+          <w:b w:val="0"/>
+          <w:i w:val="0"/>
+          <w:sz w:val="26"/>
+        </w:rPr>
+        <w:t>Mã nguồn của đồ án được đóng gói khép kín trong thư mục Ma_nguon, tuân thủ kiến trúc phân tầng module hóa chuẩn khoa học dữ liệu nhằm bảo đảm tính độc lập môi trường và khả năng tái lập 100%. Cấu trúc các thư mục chức năng chính bao gồm:</w:t>
+      </w:r>
+    </w:p>
+    <w:p>
+      <w:pPr>
+        <w:spacing w:line="360" w:lineRule="auto" w:before="0" w:after="60"/>
+        <w:ind w:left="360"/>
+        <w:jc w:val="both"/>
+      </w:pPr>
+      <w:r/>
+      <w:r>
+        <w:rPr>
+          <w:rFonts w:ascii="Times New Roman" w:hAnsi="Times New Roman"/>
+          <w:b/>
+          <w:sz w:val="26"/>
+        </w:rPr>
+        <w:t xml:space="preserve">• app/: </w:t>
+      </w:r>
+      <w:r>
+        <w:rPr>
+          <w:rFonts w:ascii="Times New Roman" w:hAnsi="Times New Roman"/>
+          <w:sz w:val="26"/>
+        </w:rPr>
+        <w:t>Chứa mã nguồn ứng dụng tương tác giao diện trực quan Streamlit (tệp điều phối app.py và thư mục components/), kết nối toàn bộ dữ liệu 5 năm và mô hình phân cụm phục vụ demo vấn đáp.</w:t>
+      </w:r>
+    </w:p>
+    <w:p>
+      <w:pPr>
+        <w:spacing w:line="360" w:lineRule="auto" w:before="0" w:after="60"/>
+        <w:ind w:left="360"/>
+        <w:jc w:val="both"/>
+      </w:pPr>
+      <w:r/>
+      <w:r>
+        <w:rPr>
+          <w:rFonts w:ascii="Times New Roman" w:hAnsi="Times New Roman"/>
+          <w:b/>
+          <w:sz w:val="26"/>
+        </w:rPr>
+        <w:t xml:space="preserve">• data/: </w:t>
+      </w:r>
+      <w:r>
+        <w:rPr>
+          <w:rFonts w:ascii="Times New Roman" w:hAnsi="Times New Roman"/>
+          <w:sz w:val="26"/>
+        </w:rPr>
+        <w:t>Bao gồm thư mục raw/ chứa các tệp CSV gốc của World Happiness Report (2015–2019) tải từ Kaggle; và interim/ chứa tệp dữ liệu sạch hợp nhất happiness_merged.csv (781 bản ghi, đã chuẩn hóa tên quốc gia, bổ sung mã chuẩn hóa ISO-3 và xử lý giá trị khuyết thiếu của United Arab Emirates 2018).</w:t>
+      </w:r>
+    </w:p>
+    <w:p>
+      <w:pPr>
+        <w:spacing w:line="360" w:lineRule="auto" w:before="0" w:after="60"/>
+        <w:ind w:left="360"/>
+        <w:jc w:val="both"/>
+      </w:pPr>
+      <w:r/>
+      <w:r>
+        <w:rPr>
+          <w:rFonts w:ascii="Times New Roman" w:hAnsi="Times New Roman"/>
+          <w:b/>
+          <w:sz w:val="26"/>
+        </w:rPr>
+        <w:t xml:space="preserve">• notebooks/: </w:t>
+      </w:r>
+      <w:r>
+        <w:rPr>
+          <w:rFonts w:ascii="Times New Roman" w:hAnsi="Times New Roman"/>
+          <w:sz w:val="26"/>
+        </w:rPr>
+        <w:t>Chuỗi 4 cuốn Jupyter Notebook được đánh số tuần tự theo 11 bước pipeline chuẩn của đề cương môn học (01_data_acquisition_and_preprocessing.ipynb, 02_exploratory_data_analysis.ipynb, 03_clustering_and_benchmarking.ipynb, 04_cluster_profiling_and_evaluation.ipynb).</w:t>
+      </w:r>
+    </w:p>
+    <w:p>
+      <w:pPr>
+        <w:spacing w:line="360" w:lineRule="auto" w:before="0" w:after="60"/>
+        <w:ind w:left="360"/>
+        <w:jc w:val="both"/>
+      </w:pPr>
+      <w:r/>
+      <w:r>
+        <w:rPr>
+          <w:rFonts w:ascii="Times New Roman" w:hAnsi="Times New Roman"/>
+          <w:b/>
+          <w:sz w:val="26"/>
+        </w:rPr>
+        <w:t xml:space="preserve">• reports/: </w:t>
+      </w:r>
+      <w:r>
+        <w:rPr>
+          <w:rFonts w:ascii="Times New Roman" w:hAnsi="Times New Roman"/>
+          <w:sz w:val="26"/>
+        </w:rPr>
+        <w:t>Lưu trữ các bảng dữ liệu thực nghiệm xuất ra dạng CSV (tables/), hệ thống biểu đồ trực quan độ phân giải cao (figures/), nhật ký kiểm định hệ thống (logs/) và các tài liệu kế hoạch, phân công công việc.</w:t>
+      </w:r>
+    </w:p>
+    <w:p>
+      <w:pPr>
+        <w:spacing w:line="360" w:lineRule="auto" w:before="0" w:after="60"/>
+        <w:ind w:left="360"/>
+        <w:jc w:val="both"/>
+      </w:pPr>
+      <w:r/>
+      <w:r>
+        <w:rPr>
+          <w:rFonts w:ascii="Times New Roman" w:hAnsi="Times New Roman"/>
+          <w:b/>
+          <w:sz w:val="26"/>
+        </w:rPr>
+        <w:t xml:space="preserve">• scripts/: </w:t>
+      </w:r>
+      <w:r>
+        <w:rPr>
+          <w:rFonts w:ascii="Times New Roman" w:hAnsi="Times New Roman"/>
+          <w:sz w:val="26"/>
+        </w:rPr>
+        <w:t>Bộ công cụ tự động hóa, kịch bản kiểm thử độc lập 54 tiêu chí chất lượng toàn diện (audit_day27_clean_pipeline.py) và kịch bản xác minh thuật toán tự lập trình from-scratch (verify_scratch_implementations.py).</w:t>
+      </w:r>
+    </w:p>
+    <w:p>
+      <w:pPr>
+        <w:spacing w:line="360" w:lineRule="auto" w:before="0" w:after="60"/>
+        <w:ind w:left="360"/>
+        <w:jc w:val="both"/>
+      </w:pPr>
+      <w:r/>
+      <w:r>
+        <w:rPr>
+          <w:rFonts w:ascii="Times New Roman" w:hAnsi="Times New Roman"/>
+          <w:b/>
+          <w:sz w:val="26"/>
+        </w:rPr>
+        <w:t xml:space="preserve">• src/: </w:t>
+      </w:r>
+      <w:r>
+        <w:rPr>
+          <w:rFonts w:ascii="Times New Roman" w:hAnsi="Times New Roman"/>
+          <w:sz w:val="26"/>
+        </w:rPr>
+        <w:t>Thư viện hàm cốt lõi do nhóm tự xây dựng từ đầu (data_loader.py, preprocessor.py, kmeans.py, hierarchical.py, dbscan.py, pca.py, metrics.py, visualization.py) bằng NumPy và Pandas sơ cấp, không dùng các hàm huấn luyện có sẵn.</w:t>
+      </w:r>
+    </w:p>
+    <w:p>
+      <w:pPr>
+        <w:pStyle w:val="Heading2"/>
+        <w:spacing w:line="360" w:lineRule="auto" w:before="120" w:after="80"/>
+        <w:jc w:val="left"/>
+      </w:pPr>
+      <w:r/>
+      <w:r>
+        <w:rPr>
+          <w:rFonts w:ascii="Times New Roman" w:hAnsi="Times New Roman"/>
+          <w:b/>
+          <w:i w:val="0"/>
+          <w:sz w:val="26"/>
+        </w:rPr>
+        <w:t>C.2. Yêu cầu môi trường và quy trình cài đặt</w:t>
+      </w:r>
+    </w:p>
+    <w:p>
+      <w:pPr>
+        <w:spacing w:line="360" w:lineRule="auto" w:before="0" w:after="80"/>
+        <w:jc w:val="both"/>
+      </w:pPr>
+      <w:r/>
+      <w:r>
+        <w:rPr>
+          <w:rFonts w:ascii="Times New Roman" w:hAnsi="Times New Roman"/>
+          <w:b w:val="0"/>
+          <w:i w:val="0"/>
+          <w:sz w:val="26"/>
+        </w:rPr>
+        <w:t>Đồ án yêu cầu môi trường thực thi Python phiên bản 3.10 trở lên (khuyến nghị chuẩn Python 3.12). Người dùng có thể thiết lập môi trường cô lập theo các bước sau:</w:t>
+      </w:r>
+    </w:p>
+    <w:p>
+      <w:pPr>
+        <w:spacing w:line="360" w:lineRule="auto" w:before="0" w:after="40"/>
+        <w:ind w:left="360"/>
+        <w:jc w:val="left"/>
+      </w:pPr>
+      <w:r/>
+      <w:r>
+        <w:rPr>
+          <w:rFonts w:ascii="Times New Roman" w:hAnsi="Times New Roman"/>
+          <w:i/>
+          <w:sz w:val="24"/>
+        </w:rPr>
+        <w:t>1. Tạo môi trường ảo riêng biệt: python -m venv .venv</w:t>
+      </w:r>
+    </w:p>
+    <w:p>
+      <w:pPr>
+        <w:spacing w:line="360" w:lineRule="auto" w:before="0" w:after="40"/>
+        <w:ind w:left="360"/>
+        <w:jc w:val="left"/>
+      </w:pPr>
+      <w:r/>
+      <w:r>
+        <w:rPr>
+          <w:rFonts w:ascii="Times New Roman" w:hAnsi="Times New Roman"/>
+          <w:i/>
+          <w:sz w:val="24"/>
+        </w:rPr>
+        <w:t>2. Kích hoạt môi trường ảo: .venv\Scripts\activate (trên hệ điều hành Windows) hoặc source .venv/bin/activate (trên Linux/macOS).</w:t>
+      </w:r>
+    </w:p>
+    <w:p>
+      <w:pPr>
+        <w:spacing w:line="360" w:lineRule="auto" w:before="0" w:after="40"/>
+        <w:ind w:left="360"/>
+        <w:jc w:val="left"/>
+      </w:pPr>
+      <w:r/>
+      <w:r>
+        <w:rPr>
+          <w:rFonts w:ascii="Times New Roman" w:hAnsi="Times New Roman"/>
+          <w:i/>
+          <w:sz w:val="24"/>
+        </w:rPr>
+        <w:t>3. Cài đặt đầy đủ các thư viện phụ thuộc theo phiên bản chốt tại requirements.txt: pip install -r requirements.txt</w:t>
+      </w:r>
+    </w:p>
+    <w:p>
+      <w:pPr>
+        <w:pStyle w:val="Heading2"/>
+        <w:spacing w:line="360" w:lineRule="auto" w:before="120" w:after="80"/>
+        <w:jc w:val="left"/>
+      </w:pPr>
+      <w:r/>
+      <w:r>
+        <w:rPr>
+          <w:rFonts w:ascii="Times New Roman" w:hAnsi="Times New Roman"/>
+          <w:b/>
+          <w:i w:val="0"/>
+          <w:sz w:val="26"/>
+        </w:rPr>
+        <w:t>C.3. Trình tự thực thi các Jupyter Notebook</w:t>
+      </w:r>
+    </w:p>
+    <w:p>
+      <w:pPr>
+        <w:spacing w:line="360" w:lineRule="auto" w:before="0" w:after="80"/>
+        <w:jc w:val="both"/>
+      </w:pPr>
+      <w:r/>
+      <w:r>
+        <w:rPr>
+          <w:rFonts w:ascii="Times New Roman" w:hAnsi="Times New Roman"/>
+          <w:b w:val="0"/>
+          <w:i w:val="0"/>
+          <w:sz w:val="26"/>
+        </w:rPr>
+        <w:t>Để tái lập toàn bộ kết quả phân tích số liệu và biểu đồ trong báo cáo, người dùng khởi động Jupyter Lab/Notebook và chạy lần lượt tính năng Restart Kernel &amp; Run All Cells trên 4 notebook theo thứ tự nghiêm ngặt:</w:t>
+      </w:r>
+    </w:p>
+    <w:p>
+      <w:pPr>
+        <w:spacing w:line="360" w:lineRule="auto" w:before="0" w:after="60"/>
+        <w:ind w:left="360"/>
+        <w:jc w:val="both"/>
+      </w:pPr>
+      <w:r/>
+      <w:r>
+        <w:rPr>
+          <w:rFonts w:ascii="Times New Roman" w:hAnsi="Times New Roman"/>
+          <w:b/>
+          <w:sz w:val="26"/>
+        </w:rPr>
+        <w:t xml:space="preserve">• notebooks/01_data_acquisition_and_preprocessing.ipynb: </w:t>
+      </w:r>
+      <w:r>
+        <w:rPr>
+          <w:rFonts w:ascii="Times New Roman" w:hAnsi="Times New Roman"/>
+          <w:sz w:val="26"/>
+        </w:rPr>
+        <w:t>Tiếp nhận 5 bộ dữ liệu thô, chuẩn hóa cột, điền khuyết UAE 2018 và xuất tệp interim.</w:t>
+      </w:r>
+    </w:p>
+    <w:p>
+      <w:pPr>
+        <w:spacing w:line="360" w:lineRule="auto" w:before="0" w:after="60"/>
+        <w:ind w:left="360"/>
+        <w:jc w:val="both"/>
+      </w:pPr>
+      <w:r/>
+      <w:r>
+        <w:rPr>
+          <w:rFonts w:ascii="Times New Roman" w:hAnsi="Times New Roman"/>
+          <w:b/>
+          <w:sz w:val="26"/>
+        </w:rPr>
+        <w:t xml:space="preserve">• notebooks/02_exploratory_data_analysis.ipynb: </w:t>
+      </w:r>
+      <w:r>
+        <w:rPr>
+          <w:rFonts w:ascii="Times New Roman" w:hAnsi="Times New Roman"/>
+          <w:sz w:val="26"/>
+        </w:rPr>
+        <w:t>Khám phá phân bố sáu yếu tố, phân tích ngoại lai IQR và ma trận tương quan Pearson.</w:t>
+      </w:r>
+    </w:p>
+    <w:p>
+      <w:pPr>
+        <w:spacing w:line="360" w:lineRule="auto" w:before="0" w:after="60"/>
+        <w:ind w:left="360"/>
+        <w:jc w:val="both"/>
+      </w:pPr>
+      <w:r/>
+      <w:r>
+        <w:rPr>
+          <w:rFonts w:ascii="Times New Roman" w:hAnsi="Times New Roman"/>
+          <w:b/>
+          <w:sz w:val="26"/>
+        </w:rPr>
+        <w:t xml:space="preserve">• notebooks/03_clustering_and_benchmarking.ipynb: </w:t>
+      </w:r>
+      <w:r>
+        <w:rPr>
+          <w:rFonts w:ascii="Times New Roman" w:hAnsi="Times New Roman"/>
+          <w:sz w:val="26"/>
+        </w:rPr>
+        <w:t>Thực thi thuật toán tự cài đặt, khảo sát số cụm tối ưu k*, quét tham số DBSCAN và kiểm tra độ ổn định ARI qua mười hạt giống ngẫu nhiên.</w:t>
+      </w:r>
+    </w:p>
+    <w:p>
+      <w:pPr>
+        <w:spacing w:line="360" w:lineRule="auto" w:before="0" w:after="60"/>
+        <w:ind w:left="360"/>
+        <w:jc w:val="both"/>
+      </w:pPr>
+      <w:r/>
+      <w:r>
+        <w:rPr>
+          <w:rFonts w:ascii="Times New Roman" w:hAnsi="Times New Roman"/>
+          <w:b/>
+          <w:sz w:val="26"/>
+        </w:rPr>
+        <w:t xml:space="preserve">• notebooks/04_cluster_profiling_and_evaluation.ipynb: </w:t>
+      </w:r>
+      <w:r>
+        <w:rPr>
+          <w:rFonts w:ascii="Times New Roman" w:hAnsi="Times New Roman"/>
+          <w:sz w:val="26"/>
+        </w:rPr>
+        <w:t>Xây dựng chân dung kinh tế – xã hội 3 cụm, hậu kiểm ANOVA với điểm hạnh phúc thực tế và lập bảng dịch chuyển cụm 156 quốc gia giai đoạn 2015–2019.</w:t>
+      </w:r>
+    </w:p>
+    <w:p>
+      <w:pPr>
+        <w:pStyle w:val="Heading2"/>
+        <w:spacing w:line="360" w:lineRule="auto" w:before="120" w:after="80"/>
+        <w:jc w:val="left"/>
+      </w:pPr>
+      <w:r/>
+      <w:r>
+        <w:rPr>
+          <w:rFonts w:ascii="Times New Roman" w:hAnsi="Times New Roman"/>
+          <w:b/>
+          <w:i w:val="0"/>
+          <w:sz w:val="26"/>
+        </w:rPr>
+        <w:t>C.4. Hướng dẫn khởi chạy ứng dụng tương tác Streamlit</w:t>
+      </w:r>
+    </w:p>
+    <w:p>
+      <w:pPr>
+        <w:spacing w:line="360" w:lineRule="auto" w:before="0" w:after="80"/>
+        <w:jc w:val="both"/>
+      </w:pPr>
+      <w:r/>
+      <w:r>
+        <w:rPr>
+          <w:rFonts w:ascii="Times New Roman" w:hAnsi="Times New Roman"/>
+          <w:b w:val="0"/>
+          <w:i w:val="0"/>
+          <w:sz w:val="26"/>
+        </w:rPr>
+        <w:t>Khởi chạy ứng dụng dashboard trực quan bằng dòng lệnh: streamlit run app/app.py. Trình duyệt web sẽ tự động mở giao diện tại địa chỉ http://localhost:8501. Ứng dụng cung cấp 4 phân hệ tương tác hoàn chỉnh: (1) Khám phá dữ liệu 5 năm; (2) Kết quả phân cụm mô hình from-scratch; (3) Chân dung kinh tế – xã hội và bảng dịch chuyển cụm; (4) Thử nghiệm phân cụm một quốc gia mới dựa trên khoảng cách Euclidean đến tâm cụm tối ưu.</w:t>
+      </w:r>
+    </w:p>
+    <w:p>
+      <w:pPr>
+        <w:pStyle w:val="Heading2"/>
+        <w:spacing w:line="360" w:lineRule="auto" w:before="120" w:after="80"/>
+        <w:jc w:val="left"/>
+      </w:pPr>
+      <w:r/>
+      <w:r>
+        <w:rPr>
+          <w:rFonts w:ascii="Times New Roman" w:hAnsi="Times New Roman"/>
+          <w:b/>
+          <w:i w:val="0"/>
+          <w:sz w:val="26"/>
+        </w:rPr>
+        <w:t>C.5. Quy trình kiểm thử thuật toán tự cài đặt</w:t>
+      </w:r>
+    </w:p>
+    <w:p>
+      <w:pPr>
+        <w:spacing w:line="360" w:lineRule="auto" w:before="0" w:after="120"/>
+        <w:jc w:val="both"/>
+      </w:pPr>
+      <w:r/>
+      <w:r>
+        <w:rPr>
+          <w:rFonts w:ascii="Times New Roman" w:hAnsi="Times New Roman"/>
+          <w:b w:val="0"/>
+          <w:i w:val="0"/>
+          <w:sz w:val="26"/>
+        </w:rPr>
+        <w:t>Để đối chứng tính chính xác toán học của các thuật toán tự cài đặt from-scratch (K-Means, Ward, DBSCAN, PCA, Silhouette, Davies–Bouldin, Calinski–Harabasz, ARI) so với thư viện tham chiếu chuẩn Scikit-Learn, người dùng thực thi kịch bản kiểm định độc lập: python scripts/verify_scratch_implementations.py. Kết quả kiểm tra đạt tỷ lệ đồng thuận 100%, bảo đảm chất lượng khoa học của giải thuật.</w:t>
+      </w:r>
+    </w:p>
+    <w:p>
+      <w:pPr>
+        <w:spacing w:before="0" w:after="0"/>
+      </w:pPr>
+      <w:r>
+        <w:br w:type="page"/>
+      </w:r>
+    </w:p>
+    <w:p>
+      <w:pPr>
+        <w:pStyle w:val="Heading1"/>
+        <w:spacing w:line="360" w:lineRule="auto" w:before="240" w:after="120"/>
+        <w:jc w:val="left"/>
+      </w:pPr>
+      <w:r/>
+      <w:r>
+        <w:rPr>
+          <w:rFonts w:ascii="Times New Roman" w:hAnsi="Times New Roman"/>
+          <w:b/>
+          <w:i w:val="0"/>
+          <w:sz w:val="30"/>
+        </w:rPr>
+        <w:t>PHỤ LỤC D: VIDEO BÁO CÁO VÀ PHÂN CÔNG THUYẾT TRÌNH</w:t>
+      </w:r>
+    </w:p>
+    <w:p>
+      <w:pPr>
+        <w:pStyle w:val="Heading2"/>
+        <w:spacing w:line="360" w:lineRule="auto" w:before="120" w:after="80"/>
+        <w:jc w:val="left"/>
+      </w:pPr>
+      <w:r/>
+      <w:r>
+        <w:rPr>
+          <w:rFonts w:ascii="Times New Roman" w:hAnsi="Times New Roman"/>
+          <w:b/>
+          <w:i w:val="0"/>
+          <w:sz w:val="26"/>
+        </w:rPr>
+        <w:t>D.1. Thông tin và liên kết video báo cáo chính thức</w:t>
+      </w:r>
+    </w:p>
+    <w:p>
+      <w:pPr>
+        <w:spacing w:line="360" w:lineRule="auto" w:before="0" w:after="80"/>
+        <w:jc w:val="both"/>
+      </w:pPr>
+      <w:r/>
+      <w:r>
+        <w:rPr>
+          <w:rFonts w:ascii="Times New Roman" w:hAnsi="Times New Roman"/>
+          <w:b w:val="0"/>
+          <w:i w:val="0"/>
+          <w:sz w:val="26"/>
+        </w:rPr>
+        <w:t>Nhóm 12 đã thực hiện ghi hình và xuất bản video báo cáo thuyết trình đồ án Khai thác dữ liệu với đầy đủ sự tham gia trình bày của cả 3 thành viên, tuân thủ chặt chẽ quy định về thời lượng tối đa 12 phút theo thang điểm rubric của bộ môn. Thông tin chi tiết của video báo cáo như sau:</w:t>
+      </w:r>
+    </w:p>
+    <w:p>
+      <w:pPr>
+        <w:spacing w:line="360" w:lineRule="auto" w:before="0" w:after="60"/>
+        <w:ind w:left="360"/>
+        <w:jc w:val="both"/>
+      </w:pPr>
+      <w:r/>
+      <w:r>
+        <w:rPr>
+          <w:rFonts w:ascii="Times New Roman" w:hAnsi="Times New Roman"/>
+          <w:b/>
+          <w:sz w:val="26"/>
+        </w:rPr>
+        <w:t xml:space="preserve">• Đường dẫn xem trực tiếp (YouTube): </w:t>
+      </w:r>
+      <w:r>
+        <w:rPr>
+          <w:rFonts w:ascii="Times New Roman" w:hAnsi="Times New Roman"/>
+          <w:i/>
+          <w:sz w:val="26"/>
+          <w:u w:val="single"/>
+        </w:rPr>
+        <w:t>https://youtu.be/YbmrPYctDg0?si=w0s5sPbvQadSknc6</w:t>
+      </w:r>
+    </w:p>
+    <w:p>
+      <w:pPr>
+        <w:spacing w:line="360" w:lineRule="auto" w:before="0" w:after="60"/>
+        <w:ind w:left="360"/>
+        <w:jc w:val="both"/>
+      </w:pPr>
+      <w:r/>
+      <w:r>
+        <w:rPr>
+          <w:rFonts w:ascii="Times New Roman" w:hAnsi="Times New Roman"/>
+          <w:b/>
+          <w:sz w:val="26"/>
+        </w:rPr>
+        <w:t xml:space="preserve">• Chế độ truy cập: </w:t>
+      </w:r>
+      <w:r>
+        <w:rPr>
+          <w:rFonts w:ascii="Times New Roman" w:hAnsi="Times New Roman"/>
+          <w:sz w:val="26"/>
+        </w:rPr>
+        <w:t>Công khai (Public), xem trực tiếp trên mọi thiết bị và trình duyệt, không yêu cầu cấp quyền hay đăng nhập tài khoản.</w:t>
+      </w:r>
+    </w:p>
+    <w:p>
+      <w:pPr>
+        <w:spacing w:line="360" w:lineRule="auto" w:before="0" w:after="60"/>
+        <w:ind w:left="360"/>
+        <w:jc w:val="both"/>
+      </w:pPr>
+      <w:r/>
+      <w:r>
+        <w:rPr>
+          <w:rFonts w:ascii="Times New Roman" w:hAnsi="Times New Roman"/>
+          <w:b/>
+          <w:sz w:val="26"/>
+        </w:rPr>
+        <w:t xml:space="preserve">• Thời lượng video: </w:t>
+      </w:r>
+      <w:r>
+        <w:rPr>
+          <w:rFonts w:ascii="Times New Roman" w:hAnsi="Times New Roman"/>
+          <w:sz w:val="26"/>
+        </w:rPr>
+        <w:t>11 phút 40 giây (thỏa mãn yêu cầu khống chế thời lượng ≤ 12 phút).</w:t>
+      </w:r>
+    </w:p>
+    <w:p>
+      <w:pPr>
+        <w:spacing w:line="360" w:lineRule="auto" w:before="0" w:after="60"/>
+        <w:ind w:left="360"/>
+        <w:jc w:val="both"/>
+      </w:pPr>
+      <w:r/>
+      <w:r>
+        <w:rPr>
+          <w:rFonts w:ascii="Times New Roman" w:hAnsi="Times New Roman"/>
+          <w:b/>
+          <w:sz w:val="26"/>
+        </w:rPr>
+        <w:t xml:space="preserve">• Chất lượng xuất bản: </w:t>
+      </w:r>
+      <w:r>
+        <w:rPr>
+          <w:rFonts w:ascii="Times New Roman" w:hAnsi="Times New Roman"/>
+          <w:sz w:val="26"/>
+        </w:rPr>
+        <w:t>Độ phân giải Full HD 1080p (1920x1080), âm thanh rõ ràng, nhúng trực tiếp slide thuyết trình 17 trang và thao tác thực nghiệm demo ứng dụng.</w:t>
+      </w:r>
+    </w:p>
+    <w:p>
+      <w:pPr>
+        <w:pStyle w:val="Heading2"/>
+        <w:spacing w:line="360" w:lineRule="auto" w:before="120" w:after="80"/>
+        <w:jc w:val="left"/>
+      </w:pPr>
+      <w:r/>
+      <w:r>
+        <w:rPr>
+          <w:rFonts w:ascii="Times New Roman" w:hAnsi="Times New Roman"/>
+          <w:b/>
+          <w:i w:val="0"/>
+          <w:sz w:val="26"/>
+        </w:rPr>
+        <w:t>D.2. Bảng phân công thời lượng và nội dung thuyết trình</w:t>
+      </w:r>
+    </w:p>
+    <w:p>
+      <w:pPr>
+        <w:spacing w:line="360" w:lineRule="auto" w:before="0" w:after="80"/>
+        <w:jc w:val="both"/>
+      </w:pPr>
+      <w:r/>
+      <w:r>
+        <w:rPr>
+          <w:rFonts w:ascii="Times New Roman" w:hAnsi="Times New Roman"/>
+          <w:b w:val="0"/>
+          <w:i w:val="0"/>
+          <w:sz w:val="26"/>
+        </w:rPr>
+        <w:t>Nhóm áp dụng nguyên tắc 'ai trực tiếp thực hiện nội dung nào sẽ chịu trách nhiệm thuyết trình nội dung đó' nhằm thể hiện năng lực chuyên môn trung thực và đồng đều giữa các thành viên. Chi tiết phân công thể hiện tại Bảng D.1:</w:t>
+      </w:r>
+    </w:p>
+    <w:p>
+      <w:pPr>
+        <w:spacing w:before="80" w:after="80"/>
+        <w:jc w:val="center"/>
+      </w:pPr>
+      <w:r/>
+      <w:r>
+        <w:rPr>
+          <w:rFonts w:ascii="Times New Roman" w:hAnsi="Times New Roman"/>
+          <w:i/>
+          <w:sz w:val="23"/>
+        </w:rPr>
+        <w:t>Bảng D.1: Phân công nội dung thuyết trình video báo cáo nhóm 12</w:t>
+      </w:r>
+    </w:p>
+    <w:tbl>
+      <w:tblPr>
+        <w:tblStyle w:val="TableGrid"/>
+        <w:tblW w:type="auto" w:w="0"/>
+        <w:jc w:val="center"/>
+        <w:tblLook w:firstColumn="1" w:firstRow="1" w:lastColumn="0" w:lastRow="0" w:noHBand="0" w:noVBand="1" w:val="04A0"/>
+      </w:tblPr>
+      <w:tblGrid>
+        <w:gridCol w:w="1881"/>
+        <w:gridCol w:w="1881"/>
+        <w:gridCol w:w="1881"/>
+        <w:gridCol w:w="1881"/>
+        <w:gridCol w:w="1881"/>
+      </w:tblGrid>
+      <w:tr>
+        <w:tc>
+          <w:tcPr>
+            <w:tcW w:type="dxa" w:w="720"/>
+            <w:shd w:fill="EAEAEA"/>
+            <w:tcBorders>
+              <w:top w:val="single" w:sz="6" w:space="0" w:color="000000"/>
+              <w:left w:val="single" w:sz="6" w:space="0" w:color="000000"/>
+              <w:bottom w:val="single" w:sz="6" w:space="0" w:color="000000"/>
+              <w:right w:val="single" w:sz="6" w:space="0" w:color="000000"/>
+            </w:tcBorders>
+          </w:tcPr>
+          <w:p>
+            <w:pPr>
+              <w:spacing w:before="60" w:after="60" w:line="276" w:lineRule="auto"/>
+              <w:jc w:val="center"/>
+            </w:pPr>
+            <w:r/>
+            <w:r>
+              <w:rPr>
+                <w:rFonts w:ascii="Times New Roman" w:hAnsi="Times New Roman"/>
+                <w:b/>
+                <w:sz w:val="22"/>
+              </w:rPr>
+              <w:t>STT</w:t>
+            </w:r>
+          </w:p>
+        </w:tc>
+        <w:tc>
+          <w:tcPr>
+            <w:tcW w:type="dxa" w:w="2592"/>
+            <w:shd w:fill="EAEAEA"/>
+            <w:tcBorders>
+              <w:top w:val="single" w:sz="6" w:space="0" w:color="000000"/>
+              <w:left w:val="single" w:sz="6" w:space="0" w:color="000000"/>
+              <w:bottom w:val="single" w:sz="6" w:space="0" w:color="000000"/>
+              <w:right w:val="single" w:sz="6" w:space="0" w:color="000000"/>
+            </w:tcBorders>
+          </w:tcPr>
+          <w:p>
+            <w:pPr>
+              <w:spacing w:before="60" w:after="60" w:line="276" w:lineRule="auto"/>
+              <w:jc w:val="center"/>
+            </w:pPr>
+            <w:r/>
+            <w:r>
+              <w:rPr>
+                <w:rFonts w:ascii="Times New Roman" w:hAnsi="Times New Roman"/>
+                <w:b/>
+                <w:sz w:val="22"/>
+              </w:rPr>
+              <w:t>Thành viên &amp; MSSV</w:t>
+            </w:r>
+          </w:p>
+        </w:tc>
+        <w:tc>
+          <w:tcPr>
+            <w:tcW w:type="dxa" w:w="1296"/>
+            <w:shd w:fill="EAEAEA"/>
+            <w:tcBorders>
+              <w:top w:val="single" w:sz="6" w:space="0" w:color="000000"/>
+              <w:left w:val="single" w:sz="6" w:space="0" w:color="000000"/>
+              <w:bottom w:val="single" w:sz="6" w:space="0" w:color="000000"/>
+              <w:right w:val="single" w:sz="6" w:space="0" w:color="000000"/>
+            </w:tcBorders>
+          </w:tcPr>
+          <w:p>
+            <w:pPr>
+              <w:spacing w:before="60" w:after="60" w:line="276" w:lineRule="auto"/>
+              <w:jc w:val="center"/>
+            </w:pPr>
+            <w:r/>
+            <w:r>
+              <w:rPr>
+                <w:rFonts w:ascii="Times New Roman" w:hAnsi="Times New Roman"/>
+                <w:b/>
+                <w:sz w:val="22"/>
+              </w:rPr>
+              <w:t>Slide</w:t>
+            </w:r>
+          </w:p>
+        </w:tc>
+        <w:tc>
+          <w:tcPr>
+            <w:tcW w:type="dxa" w:w="1440"/>
+            <w:shd w:fill="EAEAEA"/>
+            <w:tcBorders>
+              <w:top w:val="single" w:sz="6" w:space="0" w:color="000000"/>
+              <w:left w:val="single" w:sz="6" w:space="0" w:color="000000"/>
+              <w:bottom w:val="single" w:sz="6" w:space="0" w:color="000000"/>
+              <w:right w:val="single" w:sz="6" w:space="0" w:color="000000"/>
+            </w:tcBorders>
+          </w:tcPr>
+          <w:p>
+            <w:pPr>
+              <w:spacing w:before="60" w:after="60" w:line="276" w:lineRule="auto"/>
+              <w:jc w:val="center"/>
+            </w:pPr>
+            <w:r/>
+            <w:r>
+              <w:rPr>
+                <w:rFonts w:ascii="Times New Roman" w:hAnsi="Times New Roman"/>
+                <w:b/>
+                <w:sz w:val="22"/>
+              </w:rPr>
+              <w:t>Thời lượng</w:t>
+            </w:r>
+          </w:p>
+        </w:tc>
+        <w:tc>
+          <w:tcPr>
+            <w:tcW w:type="dxa" w:w="4032"/>
+            <w:shd w:fill="EAEAEA"/>
+            <w:tcBorders>
+              <w:top w:val="single" w:sz="6" w:space="0" w:color="000000"/>
+              <w:left w:val="single" w:sz="6" w:space="0" w:color="000000"/>
+              <w:bottom w:val="single" w:sz="6" w:space="0" w:color="000000"/>
+              <w:right w:val="single" w:sz="6" w:space="0" w:color="000000"/>
+            </w:tcBorders>
+          </w:tcPr>
+          <w:p>
+            <w:pPr>
+              <w:spacing w:before="60" w:after="60" w:line="276" w:lineRule="auto"/>
+              <w:jc w:val="center"/>
+            </w:pPr>
+            <w:r/>
+            <w:r>
+              <w:rPr>
+                <w:rFonts w:ascii="Times New Roman" w:hAnsi="Times New Roman"/>
+                <w:b/>
+                <w:sz w:val="22"/>
+              </w:rPr>
+              <w:t>Nội dung thuyết minh chi tiết</w:t>
+            </w:r>
+          </w:p>
+        </w:tc>
+      </w:tr>
+      <w:tr>
+        <w:tc>
+          <w:tcPr>
+            <w:tcW w:type="dxa" w:w="720"/>
+            <w:tcBorders>
+              <w:top w:val="single" w:sz="4" w:space="0" w:color="000000"/>
+              <w:left w:val="single" w:sz="4" w:space="0" w:color="000000"/>
+              <w:bottom w:val="single" w:sz="4" w:space="0" w:color="000000"/>
+              <w:right w:val="single" w:sz="4" w:space="0" w:color="000000"/>
+            </w:tcBorders>
+          </w:tcPr>
+          <w:p>
+            <w:pPr>
+              <w:spacing w:before="60" w:after="60" w:line="276" w:lineRule="auto"/>
+              <w:jc w:val="center"/>
+            </w:pPr>
+            <w:r/>
+            <w:r>
+              <w:rPr>
+                <w:rFonts w:ascii="Times New Roman" w:hAnsi="Times New Roman"/>
+                <w:sz w:val="21"/>
+              </w:rPr>
+              <w:t>1</w:t>
+            </w:r>
+          </w:p>
+        </w:tc>
+        <w:tc>
+          <w:tcPr>
+            <w:tcW w:type="dxa" w:w="2592"/>
+            <w:tcBorders>
+              <w:top w:val="single" w:sz="4" w:space="0" w:color="000000"/>
+              <w:left w:val="single" w:sz="4" w:space="0" w:color="000000"/>
+              <w:bottom w:val="single" w:sz="4" w:space="0" w:color="000000"/>
+              <w:right w:val="single" w:sz="4" w:space="0" w:color="000000"/>
+            </w:tcBorders>
+          </w:tcPr>
+          <w:p>
+            <w:pPr>
+              <w:spacing w:before="60" w:after="60" w:line="276" w:lineRule="auto"/>
+              <w:jc w:val="left"/>
+            </w:pPr>
+            <w:r/>
+            <w:r>
+              <w:rPr>
+                <w:rFonts w:ascii="Times New Roman" w:hAnsi="Times New Roman"/>
+                <w:sz w:val="21"/>
+              </w:rPr>
+              <w:t>Hà Mạnh Trường</w:t>
+              <w:br/>
+              <w:t>MSSV: 2045240326</w:t>
+              <w:br/>
+              <w:t>(Nhóm trưởng)</w:t>
+            </w:r>
+          </w:p>
+        </w:tc>
+        <w:tc>
+          <w:tcPr>
+            <w:tcW w:type="dxa" w:w="1296"/>
+            <w:tcBorders>
+              <w:top w:val="single" w:sz="4" w:space="0" w:color="000000"/>
+              <w:left w:val="single" w:sz="4" w:space="0" w:color="000000"/>
+              <w:bottom w:val="single" w:sz="4" w:space="0" w:color="000000"/>
+              <w:right w:val="single" w:sz="4" w:space="0" w:color="000000"/>
+            </w:tcBorders>
+          </w:tcPr>
+          <w:p>
+            <w:pPr>
+              <w:spacing w:before="60" w:after="60" w:line="276" w:lineRule="auto"/>
+              <w:jc w:val="center"/>
+            </w:pPr>
+            <w:r/>
+            <w:r>
+              <w:rPr>
+                <w:rFonts w:ascii="Times New Roman" w:hAnsi="Times New Roman"/>
+                <w:sz w:val="21"/>
+              </w:rPr>
+              <w:t>Slide 1–4</w:t>
+            </w:r>
+          </w:p>
+        </w:tc>
+        <w:tc>
+          <w:tcPr>
+            <w:tcW w:type="dxa" w:w="1440"/>
+            <w:tcBorders>
+              <w:top w:val="single" w:sz="4" w:space="0" w:color="000000"/>
+              <w:left w:val="single" w:sz="4" w:space="0" w:color="000000"/>
+              <w:bottom w:val="single" w:sz="4" w:space="0" w:color="000000"/>
+              <w:right w:val="single" w:sz="4" w:space="0" w:color="000000"/>
+            </w:tcBorders>
+          </w:tcPr>
+          <w:p>
+            <w:pPr>
+              <w:spacing w:before="60" w:after="60" w:line="276" w:lineRule="auto"/>
+              <w:jc w:val="center"/>
+            </w:pPr>
+            <w:r/>
+            <w:r>
+              <w:rPr>
+                <w:rFonts w:ascii="Times New Roman" w:hAnsi="Times New Roman"/>
+                <w:sz w:val="21"/>
+              </w:rPr>
+              <w:t>~3 phút 30s</w:t>
+            </w:r>
+          </w:p>
+        </w:tc>
+        <w:tc>
+          <w:tcPr>
+            <w:tcW w:type="dxa" w:w="4032"/>
+            <w:tcBorders>
+              <w:top w:val="single" w:sz="4" w:space="0" w:color="000000"/>
+              <w:left w:val="single" w:sz="4" w:space="0" w:color="000000"/>
+              <w:bottom w:val="single" w:sz="4" w:space="0" w:color="000000"/>
+              <w:right w:val="single" w:sz="4" w:space="0" w:color="000000"/>
+            </w:tcBorders>
+          </w:tcPr>
+          <w:p>
+            <w:pPr>
+              <w:spacing w:before="60" w:after="60" w:line="276" w:lineRule="auto"/>
+              <w:jc w:val="left"/>
+            </w:pPr>
+            <w:r/>
+            <w:r>
+              <w:rPr>
+                <w:rFonts w:ascii="Times New Roman" w:hAnsi="Times New Roman"/>
+                <w:sz w:val="21"/>
+              </w:rPr>
+              <w:t>Trình bày Bối cảnh và lý do chọn đề tài, Mục tiêu nghiên cứu và bài toán gom cụm; Kiến trúc 11 bước của pipeline tổng thể; Quy trình thu thập, tiền xử lý dữ liệu 5 năm (2015–2019) và phương án xử lý bản ghi khuyết thiếu UAE 2018.</w:t>
+            </w:r>
+          </w:p>
+        </w:tc>
+      </w:tr>
+      <w:tr>
+        <w:tc>
+          <w:tcPr>
+            <w:tcW w:type="dxa" w:w="720"/>
+            <w:tcBorders>
+              <w:top w:val="single" w:sz="4" w:space="0" w:color="000000"/>
+              <w:left w:val="single" w:sz="4" w:space="0" w:color="000000"/>
+              <w:bottom w:val="single" w:sz="4" w:space="0" w:color="000000"/>
+              <w:right w:val="single" w:sz="4" w:space="0" w:color="000000"/>
+            </w:tcBorders>
+          </w:tcPr>
+          <w:p>
+            <w:pPr>
+              <w:spacing w:before="60" w:after="60" w:line="276" w:lineRule="auto"/>
+              <w:jc w:val="center"/>
+            </w:pPr>
+            <w:r/>
+            <w:r>
+              <w:rPr>
+                <w:rFonts w:ascii="Times New Roman" w:hAnsi="Times New Roman"/>
+                <w:sz w:val="21"/>
+              </w:rPr>
+              <w:t>2</w:t>
+            </w:r>
+          </w:p>
+        </w:tc>
+        <w:tc>
+          <w:tcPr>
+            <w:tcW w:type="dxa" w:w="2592"/>
+            <w:tcBorders>
+              <w:top w:val="single" w:sz="4" w:space="0" w:color="000000"/>
+              <w:left w:val="single" w:sz="4" w:space="0" w:color="000000"/>
+              <w:bottom w:val="single" w:sz="4" w:space="0" w:color="000000"/>
+              <w:right w:val="single" w:sz="4" w:space="0" w:color="000000"/>
+            </w:tcBorders>
+          </w:tcPr>
+          <w:p>
+            <w:pPr>
+              <w:spacing w:before="60" w:after="60" w:line="276" w:lineRule="auto"/>
+              <w:jc w:val="left"/>
+            </w:pPr>
+            <w:r/>
+            <w:r>
+              <w:rPr>
+                <w:rFonts w:ascii="Times New Roman" w:hAnsi="Times New Roman"/>
+                <w:sz w:val="21"/>
+              </w:rPr>
+              <w:t>Huỳnh Tâm Trí</w:t>
+              <w:br/>
+              <w:t>MSSV: 2045240315</w:t>
+              <w:br/>
+              <w:t>(Thành viên)</w:t>
+            </w:r>
+          </w:p>
+        </w:tc>
+        <w:tc>
+          <w:tcPr>
+            <w:tcW w:type="dxa" w:w="1296"/>
+            <w:tcBorders>
+              <w:top w:val="single" w:sz="4" w:space="0" w:color="000000"/>
+              <w:left w:val="single" w:sz="4" w:space="0" w:color="000000"/>
+              <w:bottom w:val="single" w:sz="4" w:space="0" w:color="000000"/>
+              <w:right w:val="single" w:sz="4" w:space="0" w:color="000000"/>
+            </w:tcBorders>
+          </w:tcPr>
+          <w:p>
+            <w:pPr>
+              <w:spacing w:before="60" w:after="60" w:line="276" w:lineRule="auto"/>
+              <w:jc w:val="center"/>
+            </w:pPr>
+            <w:r/>
+            <w:r>
+              <w:rPr>
+                <w:rFonts w:ascii="Times New Roman" w:hAnsi="Times New Roman"/>
+                <w:sz w:val="21"/>
+              </w:rPr>
+              <w:t>Slide 5–9</w:t>
+            </w:r>
+          </w:p>
+        </w:tc>
+        <w:tc>
+          <w:tcPr>
+            <w:tcW w:type="dxa" w:w="1440"/>
+            <w:tcBorders>
+              <w:top w:val="single" w:sz="4" w:space="0" w:color="000000"/>
+              <w:left w:val="single" w:sz="4" w:space="0" w:color="000000"/>
+              <w:bottom w:val="single" w:sz="4" w:space="0" w:color="000000"/>
+              <w:right w:val="single" w:sz="4" w:space="0" w:color="000000"/>
+            </w:tcBorders>
+          </w:tcPr>
+          <w:p>
+            <w:pPr>
+              <w:spacing w:before="60" w:after="60" w:line="276" w:lineRule="auto"/>
+              <w:jc w:val="center"/>
+            </w:pPr>
+            <w:r/>
+            <w:r>
+              <w:rPr>
+                <w:rFonts w:ascii="Times New Roman" w:hAnsi="Times New Roman"/>
+                <w:sz w:val="21"/>
+              </w:rPr>
+              <w:t>~4 phút 00s</w:t>
+            </w:r>
+          </w:p>
+        </w:tc>
+        <w:tc>
+          <w:tcPr>
+            <w:tcW w:type="dxa" w:w="4032"/>
+            <w:tcBorders>
+              <w:top w:val="single" w:sz="4" w:space="0" w:color="000000"/>
+              <w:left w:val="single" w:sz="4" w:space="0" w:color="000000"/>
+              <w:bottom w:val="single" w:sz="4" w:space="0" w:color="000000"/>
+              <w:right w:val="single" w:sz="4" w:space="0" w:color="000000"/>
+            </w:tcBorders>
+          </w:tcPr>
+          <w:p>
+            <w:pPr>
+              <w:spacing w:before="60" w:after="60" w:line="276" w:lineRule="auto"/>
+              <w:jc w:val="left"/>
+            </w:pPr>
+            <w:r/>
+            <w:r>
+              <w:rPr>
+                <w:rFonts w:ascii="Times New Roman" w:hAnsi="Times New Roman"/>
+                <w:sz w:val="21"/>
+              </w:rPr>
+              <w:t>Trình bày Khám phá dữ liệu (EDA), phân bố sáu yếu tố và ngoại lai IQR; Cơ sở chuẩn hóa Z-score và giảm chiều PCA; Cài đặt thuật toán from-scratch (K-Means++, Ward, DBSCAN); Thẩm định số cụm tối ưu k*=3 và kiểm định độ ổn định ARI qua mười hạt giống.</w:t>
+            </w:r>
+          </w:p>
+        </w:tc>
+      </w:tr>
+      <w:tr>
+        <w:tc>
+          <w:tcPr>
+            <w:tcW w:type="dxa" w:w="720"/>
+            <w:tcBorders>
+              <w:top w:val="single" w:sz="4" w:space="0" w:color="000000"/>
+              <w:left w:val="single" w:sz="4" w:space="0" w:color="000000"/>
+              <w:bottom w:val="single" w:sz="4" w:space="0" w:color="000000"/>
+              <w:right w:val="single" w:sz="4" w:space="0" w:color="000000"/>
+            </w:tcBorders>
+          </w:tcPr>
+          <w:p>
+            <w:pPr>
+              <w:spacing w:before="60" w:after="60" w:line="276" w:lineRule="auto"/>
+              <w:jc w:val="center"/>
+            </w:pPr>
+            <w:r/>
+            <w:r>
+              <w:rPr>
+                <w:rFonts w:ascii="Times New Roman" w:hAnsi="Times New Roman"/>
+                <w:sz w:val="21"/>
+              </w:rPr>
+              <w:t>3</w:t>
+            </w:r>
+          </w:p>
+        </w:tc>
+        <w:tc>
+          <w:tcPr>
+            <w:tcW w:type="dxa" w:w="2592"/>
+            <w:tcBorders>
+              <w:top w:val="single" w:sz="4" w:space="0" w:color="000000"/>
+              <w:left w:val="single" w:sz="4" w:space="0" w:color="000000"/>
+              <w:bottom w:val="single" w:sz="4" w:space="0" w:color="000000"/>
+              <w:right w:val="single" w:sz="4" w:space="0" w:color="000000"/>
+            </w:tcBorders>
+          </w:tcPr>
+          <w:p>
+            <w:pPr>
+              <w:spacing w:before="60" w:after="60" w:line="276" w:lineRule="auto"/>
+              <w:jc w:val="left"/>
+            </w:pPr>
+            <w:r/>
+            <w:r>
+              <w:rPr>
+                <w:rFonts w:ascii="Times New Roman" w:hAnsi="Times New Roman"/>
+                <w:sz w:val="21"/>
+              </w:rPr>
+              <w:t>Ngô Quang Trung</w:t>
+              <w:br/>
+              <w:t>MSSV: 2045240325</w:t>
+              <w:br/>
+              <w:t>(Thành viên)</w:t>
+            </w:r>
+          </w:p>
+        </w:tc>
+        <w:tc>
+          <w:tcPr>
+            <w:tcW w:type="dxa" w:w="1296"/>
+            <w:tcBorders>
+              <w:top w:val="single" w:sz="4" w:space="0" w:color="000000"/>
+              <w:left w:val="single" w:sz="4" w:space="0" w:color="000000"/>
+              <w:bottom w:val="single" w:sz="4" w:space="0" w:color="000000"/>
+              <w:right w:val="single" w:sz="4" w:space="0" w:color="000000"/>
+            </w:tcBorders>
+          </w:tcPr>
+          <w:p>
+            <w:pPr>
+              <w:spacing w:before="60" w:after="60" w:line="276" w:lineRule="auto"/>
+              <w:jc w:val="center"/>
+            </w:pPr>
+            <w:r/>
+            <w:r>
+              <w:rPr>
+                <w:rFonts w:ascii="Times New Roman" w:hAnsi="Times New Roman"/>
+                <w:sz w:val="21"/>
+              </w:rPr>
+              <w:t>Slide 10–17</w:t>
+            </w:r>
+          </w:p>
+        </w:tc>
+        <w:tc>
+          <w:tcPr>
+            <w:tcW w:type="dxa" w:w="1440"/>
+            <w:tcBorders>
+              <w:top w:val="single" w:sz="4" w:space="0" w:color="000000"/>
+              <w:left w:val="single" w:sz="4" w:space="0" w:color="000000"/>
+              <w:bottom w:val="single" w:sz="4" w:space="0" w:color="000000"/>
+              <w:right w:val="single" w:sz="4" w:space="0" w:color="000000"/>
+            </w:tcBorders>
+          </w:tcPr>
+          <w:p>
+            <w:pPr>
+              <w:spacing w:before="60" w:after="60" w:line="276" w:lineRule="auto"/>
+              <w:jc w:val="center"/>
+            </w:pPr>
+            <w:r/>
+            <w:r>
+              <w:rPr>
+                <w:rFonts w:ascii="Times New Roman" w:hAnsi="Times New Roman"/>
+                <w:sz w:val="21"/>
+              </w:rPr>
+              <w:t>~4 phút 10s</w:t>
+            </w:r>
+          </w:p>
+        </w:tc>
+        <w:tc>
+          <w:tcPr>
+            <w:tcW w:type="dxa" w:w="4032"/>
+            <w:tcBorders>
+              <w:top w:val="single" w:sz="4" w:space="0" w:color="000000"/>
+              <w:left w:val="single" w:sz="4" w:space="0" w:color="000000"/>
+              <w:bottom w:val="single" w:sz="4" w:space="0" w:color="000000"/>
+              <w:right w:val="single" w:sz="4" w:space="0" w:color="000000"/>
+            </w:tcBorders>
+          </w:tcPr>
+          <w:p>
+            <w:pPr>
+              <w:spacing w:before="60" w:after="60" w:line="276" w:lineRule="auto"/>
+              <w:jc w:val="left"/>
+            </w:pPr>
+            <w:r/>
+            <w:r>
+              <w:rPr>
+                <w:rFonts w:ascii="Times New Roman" w:hAnsi="Times New Roman"/>
+                <w:sz w:val="21"/>
+              </w:rPr>
+              <w:t>Trình bày Chân dung kinh tế – xã hội 3 cụm quốc gia; Hậu kiểm ANOVA với điểm hạnh phúc thực tế; Bảng dịch chuyển cụm 156 quốc gia qua 5 năm; Trực tiếp thao tác chạy demo ứng dụng tương tác Streamlit 4 tab; Tổng kết đóng góp, hạn chế và kết luận.</w:t>
+            </w:r>
+          </w:p>
+        </w:tc>
+      </w:tr>
+    </w:tbl>
     <w:sectPr>
       <w:headerReference w:type="default" r:id="rId27"/>
       <w:footerReference w:type="default" r:id="rId28"/>

</xml_diff>